<commit_message>
Add section-wise and slot-wise summary roll-ups to conversion-target doc
Two new summary tables (aggregated by section and by slot across sections) with impressions, blended CPMs by channel, prog/direct split, and target opportunity. Reconciled to grand totals. Sections renumbered 1-7.
</commit_message>
<xml_diff>
--- a/pg-pd-opportunity/TIME_PG-PD_Conversion_Targets_by_Slot.docx
+++ b/pg-pd-opportunity/TIME_PG-PD_Conversion_Targets_by_Slot.docx
@@ -224,7 +224,3135 @@
           <w:color w:val="0B5C65"/>
           <w:sz w:val="24"/>
         </w:rPr>
-        <w:t>1.  Conversion Targets — Ranked</w:t>
+        <w:t>1.  Section-wise Summary</w:t>
+      </w:r>
+    </w:p>
+    <w:p>
+      <w:pPr>
+        <w:spacing w:after="100"/>
+      </w:pPr>
+      <w:r>
+        <w:rPr>
+          <w:b w:val="0"/>
+          <w:i w:val="0"/>
+          <w:color w:val="1F2A30"/>
+          <w:sz w:val="21"/>
+        </w:rPr>
+        <w:t>All five sections at a glance — total impressions and blended CPMs by channel, the programmatic vs direct split, and the target PG/PD opportunity within each section (10% shift).</w:t>
+      </w:r>
+    </w:p>
+    <w:tbl>
+      <w:tblPr>
+        <w:tblW w:type="auto" w:w="0"/>
+        <w:jc w:val="center"/>
+        <w:tblLook w:firstColumn="1" w:firstRow="1" w:lastColumn="0" w:lastRow="0" w:noHBand="0" w:noVBand="1" w:val="04A0"/>
+        <w:tblBorders>
+          <w:top w:val="single" w:sz="6" w:space="0" w:color="C9D2D4"/>
+          <w:left w:val="single" w:sz="6" w:space="0" w:color="C9D2D4"/>
+          <w:bottom w:val="single" w:sz="6" w:space="0" w:color="C9D2D4"/>
+          <w:right w:val="single" w:sz="6" w:space="0" w:color="C9D2D4"/>
+          <w:insideH w:val="single" w:sz="6" w:space="0" w:color="C9D2D4"/>
+          <w:insideV w:val="single" w:sz="6" w:space="0" w:color="C9D2D4"/>
+        </w:tblBorders>
+      </w:tblPr>
+      <w:tblGrid>
+        <w:gridCol w:w="1382"/>
+        <w:gridCol w:w="1382"/>
+        <w:gridCol w:w="1382"/>
+        <w:gridCol w:w="1382"/>
+        <w:gridCol w:w="1382"/>
+        <w:gridCol w:w="1382"/>
+        <w:gridCol w:w="1382"/>
+        <w:gridCol w:w="1382"/>
+        <w:gridCol w:w="1382"/>
+        <w:gridCol w:w="1382"/>
+      </w:tblGrid>
+      <w:tr>
+        <w:tc>
+          <w:tcPr>
+            <w:tcW w:type="dxa" w:w="2088"/>
+            <w:shd w:val="clear" w:fill="0B5C65"/>
+          </w:tcPr>
+          <w:p>
+            <w:pPr>
+              <w:spacing w:after="20" w:before="20"/>
+              <w:jc w:val="left"/>
+            </w:pPr>
+            <w:r/>
+            <w:r>
+              <w:rPr>
+                <w:b/>
+                <w:color w:val="FFFFFF"/>
+                <w:sz w:val="16"/>
+              </w:rPr>
+              <w:t>Section</w:t>
+            </w:r>
+          </w:p>
+        </w:tc>
+        <w:tc>
+          <w:tcPr>
+            <w:tcW w:type="dxa" w:w="1656"/>
+            <w:shd w:val="clear" w:fill="0B5C65"/>
+          </w:tcPr>
+          <w:p>
+            <w:pPr>
+              <w:spacing w:after="20" w:before="20"/>
+              <w:jc w:val="right"/>
+            </w:pPr>
+            <w:r/>
+            <w:r>
+              <w:rPr>
+                <w:b/>
+                <w:color w:val="FFFFFF"/>
+                <w:sz w:val="16"/>
+              </w:rPr>
+              <w:t>Direct imp</w:t>
+            </w:r>
+          </w:p>
+        </w:tc>
+        <w:tc>
+          <w:tcPr>
+            <w:tcW w:type="dxa" w:w="1656"/>
+            <w:shd w:val="clear" w:fill="0B5C65"/>
+          </w:tcPr>
+          <w:p>
+            <w:pPr>
+              <w:spacing w:after="20" w:before="20"/>
+              <w:jc w:val="right"/>
+            </w:pPr>
+            <w:r/>
+            <w:r>
+              <w:rPr>
+                <w:b/>
+                <w:color w:val="FFFFFF"/>
+                <w:sz w:val="16"/>
+              </w:rPr>
+              <w:t>Prog. imp</w:t>
+            </w:r>
+          </w:p>
+        </w:tc>
+        <w:tc>
+          <w:tcPr>
+            <w:tcW w:type="dxa" w:w="1512"/>
+            <w:shd w:val="clear" w:fill="0B5C65"/>
+          </w:tcPr>
+          <w:p>
+            <w:pPr>
+              <w:spacing w:after="20" w:before="20"/>
+              <w:jc w:val="right"/>
+            </w:pPr>
+            <w:r/>
+            <w:r>
+              <w:rPr>
+                <w:b/>
+                <w:color w:val="FFFFFF"/>
+                <w:sz w:val="16"/>
+              </w:rPr>
+              <w:t>House imp</w:t>
+            </w:r>
+          </w:p>
+        </w:tc>
+        <w:tc>
+          <w:tcPr>
+            <w:tcW w:type="dxa" w:w="864"/>
+            <w:shd w:val="clear" w:fill="0B5C65"/>
+          </w:tcPr>
+          <w:p>
+            <w:pPr>
+              <w:spacing w:after="20" w:before="20"/>
+              <w:jc w:val="right"/>
+            </w:pPr>
+            <w:r/>
+            <w:r>
+              <w:rPr>
+                <w:b/>
+                <w:color w:val="FFFFFF"/>
+                <w:sz w:val="16"/>
+              </w:rPr>
+              <w:t>Prog %</w:t>
+            </w:r>
+          </w:p>
+        </w:tc>
+        <w:tc>
+          <w:tcPr>
+            <w:tcW w:type="dxa" w:w="864"/>
+            <w:shd w:val="clear" w:fill="0B5C65"/>
+          </w:tcPr>
+          <w:p>
+            <w:pPr>
+              <w:spacing w:after="20" w:before="20"/>
+              <w:jc w:val="right"/>
+            </w:pPr>
+            <w:r/>
+            <w:r>
+              <w:rPr>
+                <w:b/>
+                <w:color w:val="FFFFFF"/>
+                <w:sz w:val="16"/>
+              </w:rPr>
+              <w:t>Dir %</w:t>
+            </w:r>
+          </w:p>
+        </w:tc>
+        <w:tc>
+          <w:tcPr>
+            <w:tcW w:type="dxa" w:w="1296"/>
+            <w:shd w:val="clear" w:fill="0B5C65"/>
+          </w:tcPr>
+          <w:p>
+            <w:pPr>
+              <w:spacing w:after="20" w:before="20"/>
+              <w:jc w:val="right"/>
+            </w:pPr>
+            <w:r/>
+            <w:r>
+              <w:rPr>
+                <w:b/>
+                <w:color w:val="FFFFFF"/>
+                <w:sz w:val="16"/>
+              </w:rPr>
+              <w:t>Direct CPM</w:t>
+            </w:r>
+          </w:p>
+        </w:tc>
+        <w:tc>
+          <w:tcPr>
+            <w:tcW w:type="dxa" w:w="1224"/>
+            <w:shd w:val="clear" w:fill="0B5C65"/>
+          </w:tcPr>
+          <w:p>
+            <w:pPr>
+              <w:spacing w:after="20" w:before="20"/>
+              <w:jc w:val="right"/>
+            </w:pPr>
+            <w:r/>
+            <w:r>
+              <w:rPr>
+                <w:b/>
+                <w:color w:val="FFFFFF"/>
+                <w:sz w:val="16"/>
+              </w:rPr>
+              <w:t>Prog CPM</w:t>
+            </w:r>
+          </w:p>
+        </w:tc>
+        <w:tc>
+          <w:tcPr>
+            <w:tcW w:type="dxa" w:w="1656"/>
+            <w:shd w:val="clear" w:fill="0B5C65"/>
+          </w:tcPr>
+          <w:p>
+            <w:pPr>
+              <w:spacing w:after="20" w:before="20"/>
+              <w:jc w:val="right"/>
+            </w:pPr>
+            <w:r/>
+            <w:r>
+              <w:rPr>
+                <w:b/>
+                <w:color w:val="FFFFFF"/>
+                <w:sz w:val="16"/>
+              </w:rPr>
+              <w:t>Target opp/mo @$8</w:t>
+            </w:r>
+          </w:p>
+        </w:tc>
+        <w:tc>
+          <w:tcPr>
+            <w:tcW w:type="dxa" w:w="1296"/>
+            <w:shd w:val="clear" w:fill="0B5C65"/>
+          </w:tcPr>
+          <w:p>
+            <w:pPr>
+              <w:spacing w:after="20" w:before="20"/>
+              <w:jc w:val="right"/>
+            </w:pPr>
+            <w:r/>
+            <w:r>
+              <w:rPr>
+                <w:b/>
+                <w:color w:val="FFFFFF"/>
+                <w:sz w:val="16"/>
+              </w:rPr>
+              <w:t>@$10</w:t>
+            </w:r>
+          </w:p>
+        </w:tc>
+      </w:tr>
+      <w:tr>
+        <w:tc>
+          <w:tcPr>
+            <w:tcW w:type="dxa" w:w="2088"/>
+          </w:tcPr>
+          <w:p>
+            <w:pPr>
+              <w:spacing w:after="20" w:before="20"/>
+              <w:jc w:val="left"/>
+            </w:pPr>
+            <w:r/>
+            <w:r>
+              <w:rPr>
+                <w:b w:val="0"/>
+                <w:sz w:val="17"/>
+              </w:rPr>
+              <w:t>Entertainment</w:t>
+            </w:r>
+          </w:p>
+        </w:tc>
+        <w:tc>
+          <w:tcPr>
+            <w:tcW w:type="dxa" w:w="1656"/>
+          </w:tcPr>
+          <w:p>
+            <w:pPr>
+              <w:spacing w:after="20" w:before="20"/>
+              <w:jc w:val="right"/>
+            </w:pPr>
+            <w:r/>
+            <w:r>
+              <w:rPr>
+                <w:b w:val="0"/>
+                <w:sz w:val="17"/>
+              </w:rPr>
+              <w:t>38,356,071</w:t>
+            </w:r>
+          </w:p>
+        </w:tc>
+        <w:tc>
+          <w:tcPr>
+            <w:tcW w:type="dxa" w:w="1656"/>
+          </w:tcPr>
+          <w:p>
+            <w:pPr>
+              <w:spacing w:after="20" w:before="20"/>
+              <w:jc w:val="right"/>
+            </w:pPr>
+            <w:r/>
+            <w:r>
+              <w:rPr>
+                <w:b w:val="0"/>
+                <w:sz w:val="17"/>
+              </w:rPr>
+              <w:t>96,703,650</w:t>
+            </w:r>
+          </w:p>
+        </w:tc>
+        <w:tc>
+          <w:tcPr>
+            <w:tcW w:type="dxa" w:w="1512"/>
+          </w:tcPr>
+          <w:p>
+            <w:pPr>
+              <w:spacing w:after="20" w:before="20"/>
+              <w:jc w:val="right"/>
+            </w:pPr>
+            <w:r/>
+            <w:r>
+              <w:rPr>
+                <w:b w:val="0"/>
+                <w:sz w:val="17"/>
+              </w:rPr>
+              <w:t>4,511,071</w:t>
+            </w:r>
+          </w:p>
+        </w:tc>
+        <w:tc>
+          <w:tcPr>
+            <w:tcW w:type="dxa" w:w="864"/>
+          </w:tcPr>
+          <w:p>
+            <w:pPr>
+              <w:spacing w:after="20" w:before="20"/>
+              <w:jc w:val="right"/>
+            </w:pPr>
+            <w:r/>
+            <w:r>
+              <w:rPr>
+                <w:b w:val="0"/>
+                <w:sz w:val="17"/>
+              </w:rPr>
+              <w:t>69%</w:t>
+            </w:r>
+          </w:p>
+        </w:tc>
+        <w:tc>
+          <w:tcPr>
+            <w:tcW w:type="dxa" w:w="864"/>
+          </w:tcPr>
+          <w:p>
+            <w:pPr>
+              <w:spacing w:after="20" w:before="20"/>
+              <w:jc w:val="right"/>
+            </w:pPr>
+            <w:r/>
+            <w:r>
+              <w:rPr>
+                <w:b w:val="0"/>
+                <w:sz w:val="17"/>
+              </w:rPr>
+              <w:t>27%</w:t>
+            </w:r>
+          </w:p>
+        </w:tc>
+        <w:tc>
+          <w:tcPr>
+            <w:tcW w:type="dxa" w:w="1296"/>
+          </w:tcPr>
+          <w:p>
+            <w:pPr>
+              <w:spacing w:after="20" w:before="20"/>
+              <w:jc w:val="right"/>
+            </w:pPr>
+            <w:r/>
+            <w:r>
+              <w:rPr>
+                <w:b w:val="0"/>
+                <w:sz w:val="17"/>
+              </w:rPr>
+              <w:t>$22.34</w:t>
+            </w:r>
+          </w:p>
+        </w:tc>
+        <w:tc>
+          <w:tcPr>
+            <w:tcW w:type="dxa" w:w="1224"/>
+          </w:tcPr>
+          <w:p>
+            <w:pPr>
+              <w:spacing w:after="20" w:before="20"/>
+              <w:jc w:val="right"/>
+            </w:pPr>
+            <w:r/>
+            <w:r>
+              <w:rPr>
+                <w:b w:val="0"/>
+                <w:sz w:val="17"/>
+              </w:rPr>
+              <w:t>$2.23</w:t>
+            </w:r>
+          </w:p>
+        </w:tc>
+        <w:tc>
+          <w:tcPr>
+            <w:tcW w:type="dxa" w:w="1656"/>
+          </w:tcPr>
+          <w:p>
+            <w:pPr>
+              <w:spacing w:after="20" w:before="20"/>
+              <w:jc w:val="right"/>
+            </w:pPr>
+            <w:r/>
+            <w:r>
+              <w:rPr>
+                <w:b w:val="0"/>
+                <w:sz w:val="17"/>
+              </w:rPr>
+              <w:t>$9,704</w:t>
+            </w:r>
+          </w:p>
+        </w:tc>
+        <w:tc>
+          <w:tcPr>
+            <w:tcW w:type="dxa" w:w="1296"/>
+          </w:tcPr>
+          <w:p>
+            <w:pPr>
+              <w:spacing w:after="20" w:before="20"/>
+              <w:jc w:val="right"/>
+            </w:pPr>
+            <w:r/>
+            <w:r>
+              <w:rPr>
+                <w:b w:val="0"/>
+                <w:sz w:val="17"/>
+              </w:rPr>
+              <w:t>$13,097</w:t>
+            </w:r>
+          </w:p>
+        </w:tc>
+      </w:tr>
+      <w:tr>
+        <w:tc>
+          <w:tcPr>
+            <w:tcW w:type="dxa" w:w="2088"/>
+            <w:shd w:val="clear" w:fill="F7FAFA"/>
+          </w:tcPr>
+          <w:p>
+            <w:pPr>
+              <w:spacing w:after="20" w:before="20"/>
+              <w:jc w:val="left"/>
+            </w:pPr>
+            <w:r/>
+            <w:r>
+              <w:rPr>
+                <w:b w:val="0"/>
+                <w:sz w:val="17"/>
+              </w:rPr>
+              <w:t>Health</w:t>
+            </w:r>
+          </w:p>
+        </w:tc>
+        <w:tc>
+          <w:tcPr>
+            <w:tcW w:type="dxa" w:w="1656"/>
+            <w:shd w:val="clear" w:fill="F7FAFA"/>
+          </w:tcPr>
+          <w:p>
+            <w:pPr>
+              <w:spacing w:after="20" w:before="20"/>
+              <w:jc w:val="right"/>
+            </w:pPr>
+            <w:r/>
+            <w:r>
+              <w:rPr>
+                <w:b w:val="0"/>
+                <w:sz w:val="17"/>
+              </w:rPr>
+              <w:t>34,674,311</w:t>
+            </w:r>
+          </w:p>
+        </w:tc>
+        <w:tc>
+          <w:tcPr>
+            <w:tcW w:type="dxa" w:w="1656"/>
+            <w:shd w:val="clear" w:fill="F7FAFA"/>
+          </w:tcPr>
+          <w:p>
+            <w:pPr>
+              <w:spacing w:after="20" w:before="20"/>
+              <w:jc w:val="right"/>
+            </w:pPr>
+            <w:r/>
+            <w:r>
+              <w:rPr>
+                <w:b w:val="0"/>
+                <w:sz w:val="17"/>
+              </w:rPr>
+              <w:t>49,728,287</w:t>
+            </w:r>
+          </w:p>
+        </w:tc>
+        <w:tc>
+          <w:tcPr>
+            <w:tcW w:type="dxa" w:w="1512"/>
+            <w:shd w:val="clear" w:fill="F7FAFA"/>
+          </w:tcPr>
+          <w:p>
+            <w:pPr>
+              <w:spacing w:after="20" w:before="20"/>
+              <w:jc w:val="right"/>
+            </w:pPr>
+            <w:r/>
+            <w:r>
+              <w:rPr>
+                <w:b w:val="0"/>
+                <w:sz w:val="17"/>
+              </w:rPr>
+              <w:t>3,245,781</w:t>
+            </w:r>
+          </w:p>
+        </w:tc>
+        <w:tc>
+          <w:tcPr>
+            <w:tcW w:type="dxa" w:w="864"/>
+            <w:shd w:val="clear" w:fill="F7FAFA"/>
+          </w:tcPr>
+          <w:p>
+            <w:pPr>
+              <w:spacing w:after="20" w:before="20"/>
+              <w:jc w:val="right"/>
+            </w:pPr>
+            <w:r/>
+            <w:r>
+              <w:rPr>
+                <w:b w:val="0"/>
+                <w:sz w:val="17"/>
+              </w:rPr>
+              <w:t>57%</w:t>
+            </w:r>
+          </w:p>
+        </w:tc>
+        <w:tc>
+          <w:tcPr>
+            <w:tcW w:type="dxa" w:w="864"/>
+            <w:shd w:val="clear" w:fill="F7FAFA"/>
+          </w:tcPr>
+          <w:p>
+            <w:pPr>
+              <w:spacing w:after="20" w:before="20"/>
+              <w:jc w:val="right"/>
+            </w:pPr>
+            <w:r/>
+            <w:r>
+              <w:rPr>
+                <w:b w:val="0"/>
+                <w:sz w:val="17"/>
+              </w:rPr>
+              <w:t>40%</w:t>
+            </w:r>
+          </w:p>
+        </w:tc>
+        <w:tc>
+          <w:tcPr>
+            <w:tcW w:type="dxa" w:w="1296"/>
+            <w:shd w:val="clear" w:fill="F7FAFA"/>
+          </w:tcPr>
+          <w:p>
+            <w:pPr>
+              <w:spacing w:after="20" w:before="20"/>
+              <w:jc w:val="right"/>
+            </w:pPr>
+            <w:r/>
+            <w:r>
+              <w:rPr>
+                <w:b w:val="0"/>
+                <w:sz w:val="17"/>
+              </w:rPr>
+              <w:t>$28.10</w:t>
+            </w:r>
+          </w:p>
+        </w:tc>
+        <w:tc>
+          <w:tcPr>
+            <w:tcW w:type="dxa" w:w="1224"/>
+            <w:shd w:val="clear" w:fill="F7FAFA"/>
+          </w:tcPr>
+          <w:p>
+            <w:pPr>
+              <w:spacing w:after="20" w:before="20"/>
+              <w:jc w:val="right"/>
+            </w:pPr>
+            <w:r/>
+            <w:r>
+              <w:rPr>
+                <w:b w:val="0"/>
+                <w:sz w:val="17"/>
+              </w:rPr>
+              <w:t>$3.44</w:t>
+            </w:r>
+          </w:p>
+        </w:tc>
+        <w:tc>
+          <w:tcPr>
+            <w:tcW w:type="dxa" w:w="1656"/>
+            <w:shd w:val="clear" w:fill="F7FAFA"/>
+          </w:tcPr>
+          <w:p>
+            <w:pPr>
+              <w:spacing w:after="20" w:before="20"/>
+              <w:jc w:val="right"/>
+            </w:pPr>
+            <w:r/>
+            <w:r>
+              <w:rPr>
+                <w:b w:val="0"/>
+                <w:sz w:val="17"/>
+              </w:rPr>
+              <w:t>$2,592</w:t>
+            </w:r>
+          </w:p>
+        </w:tc>
+        <w:tc>
+          <w:tcPr>
+            <w:tcW w:type="dxa" w:w="1296"/>
+            <w:shd w:val="clear" w:fill="F7FAFA"/>
+          </w:tcPr>
+          <w:p>
+            <w:pPr>
+              <w:spacing w:after="20" w:before="20"/>
+              <w:jc w:val="right"/>
+            </w:pPr>
+            <w:r/>
+            <w:r>
+              <w:rPr>
+                <w:b w:val="0"/>
+                <w:sz w:val="17"/>
+              </w:rPr>
+              <w:t>$3,596</w:t>
+            </w:r>
+          </w:p>
+        </w:tc>
+      </w:tr>
+      <w:tr>
+        <w:tc>
+          <w:tcPr>
+            <w:tcW w:type="dxa" w:w="2088"/>
+          </w:tcPr>
+          <w:p>
+            <w:pPr>
+              <w:spacing w:after="20" w:before="20"/>
+              <w:jc w:val="left"/>
+            </w:pPr>
+            <w:r/>
+            <w:r>
+              <w:rPr>
+                <w:b w:val="0"/>
+                <w:sz w:val="17"/>
+              </w:rPr>
+              <w:t>Science</w:t>
+            </w:r>
+          </w:p>
+        </w:tc>
+        <w:tc>
+          <w:tcPr>
+            <w:tcW w:type="dxa" w:w="1656"/>
+          </w:tcPr>
+          <w:p>
+            <w:pPr>
+              <w:spacing w:after="20" w:before="20"/>
+              <w:jc w:val="right"/>
+            </w:pPr>
+            <w:r/>
+            <w:r>
+              <w:rPr>
+                <w:b w:val="0"/>
+                <w:sz w:val="17"/>
+              </w:rPr>
+              <w:t>3,024,160</w:t>
+            </w:r>
+          </w:p>
+        </w:tc>
+        <w:tc>
+          <w:tcPr>
+            <w:tcW w:type="dxa" w:w="1656"/>
+          </w:tcPr>
+          <w:p>
+            <w:pPr>
+              <w:spacing w:after="20" w:before="20"/>
+              <w:jc w:val="right"/>
+            </w:pPr>
+            <w:r/>
+            <w:r>
+              <w:rPr>
+                <w:b w:val="0"/>
+                <w:sz w:val="17"/>
+              </w:rPr>
+              <w:t>7,298,045</w:t>
+            </w:r>
+          </w:p>
+        </w:tc>
+        <w:tc>
+          <w:tcPr>
+            <w:tcW w:type="dxa" w:w="1512"/>
+          </w:tcPr>
+          <w:p>
+            <w:pPr>
+              <w:spacing w:after="20" w:before="20"/>
+              <w:jc w:val="right"/>
+            </w:pPr>
+            <w:r/>
+            <w:r>
+              <w:rPr>
+                <w:b w:val="0"/>
+                <w:sz w:val="17"/>
+              </w:rPr>
+              <w:t>345,368</w:t>
+            </w:r>
+          </w:p>
+        </w:tc>
+        <w:tc>
+          <w:tcPr>
+            <w:tcW w:type="dxa" w:w="864"/>
+          </w:tcPr>
+          <w:p>
+            <w:pPr>
+              <w:spacing w:after="20" w:before="20"/>
+              <w:jc w:val="right"/>
+            </w:pPr>
+            <w:r/>
+            <w:r>
+              <w:rPr>
+                <w:b w:val="0"/>
+                <w:sz w:val="17"/>
+              </w:rPr>
+              <w:t>68%</w:t>
+            </w:r>
+          </w:p>
+        </w:tc>
+        <w:tc>
+          <w:tcPr>
+            <w:tcW w:type="dxa" w:w="864"/>
+          </w:tcPr>
+          <w:p>
+            <w:pPr>
+              <w:spacing w:after="20" w:before="20"/>
+              <w:jc w:val="right"/>
+            </w:pPr>
+            <w:r/>
+            <w:r>
+              <w:rPr>
+                <w:b w:val="0"/>
+                <w:sz w:val="17"/>
+              </w:rPr>
+              <w:t>28%</w:t>
+            </w:r>
+          </w:p>
+        </w:tc>
+        <w:tc>
+          <w:tcPr>
+            <w:tcW w:type="dxa" w:w="1296"/>
+          </w:tcPr>
+          <w:p>
+            <w:pPr>
+              <w:spacing w:after="20" w:before="20"/>
+              <w:jc w:val="right"/>
+            </w:pPr>
+            <w:r/>
+            <w:r>
+              <w:rPr>
+                <w:b w:val="0"/>
+                <w:sz w:val="17"/>
+              </w:rPr>
+              <w:t>$32.73</w:t>
+            </w:r>
+          </w:p>
+        </w:tc>
+        <w:tc>
+          <w:tcPr>
+            <w:tcW w:type="dxa" w:w="1224"/>
+          </w:tcPr>
+          <w:p>
+            <w:pPr>
+              <w:spacing w:after="20" w:before="20"/>
+              <w:jc w:val="right"/>
+            </w:pPr>
+            <w:r/>
+            <w:r>
+              <w:rPr>
+                <w:b w:val="0"/>
+                <w:sz w:val="17"/>
+              </w:rPr>
+              <w:t>$2.77</w:t>
+            </w:r>
+          </w:p>
+        </w:tc>
+        <w:tc>
+          <w:tcPr>
+            <w:tcW w:type="dxa" w:w="1656"/>
+          </w:tcPr>
+          <w:p>
+            <w:pPr>
+              <w:spacing w:after="20" w:before="20"/>
+              <w:jc w:val="right"/>
+            </w:pPr>
+            <w:r/>
+            <w:r>
+              <w:rPr>
+                <w:b w:val="0"/>
+                <w:sz w:val="17"/>
+              </w:rPr>
+              <w:t>$583</w:t>
+            </w:r>
+          </w:p>
+        </w:tc>
+        <w:tc>
+          <w:tcPr>
+            <w:tcW w:type="dxa" w:w="1296"/>
+          </w:tcPr>
+          <w:p>
+            <w:pPr>
+              <w:spacing w:after="20" w:before="20"/>
+              <w:jc w:val="right"/>
+            </w:pPr>
+            <w:r/>
+            <w:r>
+              <w:rPr>
+                <w:b w:val="0"/>
+                <w:sz w:val="17"/>
+              </w:rPr>
+              <w:t>$810</w:t>
+            </w:r>
+          </w:p>
+        </w:tc>
+      </w:tr>
+      <w:tr>
+        <w:tc>
+          <w:tcPr>
+            <w:tcW w:type="dxa" w:w="2088"/>
+            <w:shd w:val="clear" w:fill="F7FAFA"/>
+          </w:tcPr>
+          <w:p>
+            <w:pPr>
+              <w:spacing w:after="20" w:before="20"/>
+              <w:jc w:val="left"/>
+            </w:pPr>
+            <w:r/>
+            <w:r>
+              <w:rPr>
+                <w:b w:val="0"/>
+                <w:sz w:val="17"/>
+              </w:rPr>
+              <w:t>Tech</w:t>
+            </w:r>
+          </w:p>
+        </w:tc>
+        <w:tc>
+          <w:tcPr>
+            <w:tcW w:type="dxa" w:w="1656"/>
+            <w:shd w:val="clear" w:fill="F7FAFA"/>
+          </w:tcPr>
+          <w:p>
+            <w:pPr>
+              <w:spacing w:after="20" w:before="20"/>
+              <w:jc w:val="right"/>
+            </w:pPr>
+            <w:r/>
+            <w:r>
+              <w:rPr>
+                <w:b w:val="0"/>
+                <w:sz w:val="17"/>
+              </w:rPr>
+              <w:t>7,395,966</w:t>
+            </w:r>
+          </w:p>
+        </w:tc>
+        <w:tc>
+          <w:tcPr>
+            <w:tcW w:type="dxa" w:w="1656"/>
+            <w:shd w:val="clear" w:fill="F7FAFA"/>
+          </w:tcPr>
+          <w:p>
+            <w:pPr>
+              <w:spacing w:after="20" w:before="20"/>
+              <w:jc w:val="right"/>
+            </w:pPr>
+            <w:r/>
+            <w:r>
+              <w:rPr>
+                <w:b w:val="0"/>
+                <w:sz w:val="17"/>
+              </w:rPr>
+              <w:t>7,795,502</w:t>
+            </w:r>
+          </w:p>
+        </w:tc>
+        <w:tc>
+          <w:tcPr>
+            <w:tcW w:type="dxa" w:w="1512"/>
+            <w:shd w:val="clear" w:fill="F7FAFA"/>
+          </w:tcPr>
+          <w:p>
+            <w:pPr>
+              <w:spacing w:after="20" w:before="20"/>
+              <w:jc w:val="right"/>
+            </w:pPr>
+            <w:r/>
+            <w:r>
+              <w:rPr>
+                <w:b w:val="0"/>
+                <w:sz w:val="17"/>
+              </w:rPr>
+              <w:t>448,926</w:t>
+            </w:r>
+          </w:p>
+        </w:tc>
+        <w:tc>
+          <w:tcPr>
+            <w:tcW w:type="dxa" w:w="864"/>
+            <w:shd w:val="clear" w:fill="F7FAFA"/>
+          </w:tcPr>
+          <w:p>
+            <w:pPr>
+              <w:spacing w:after="20" w:before="20"/>
+              <w:jc w:val="right"/>
+            </w:pPr>
+            <w:r/>
+            <w:r>
+              <w:rPr>
+                <w:b w:val="0"/>
+                <w:sz w:val="17"/>
+              </w:rPr>
+              <w:t>50%</w:t>
+            </w:r>
+          </w:p>
+        </w:tc>
+        <w:tc>
+          <w:tcPr>
+            <w:tcW w:type="dxa" w:w="864"/>
+            <w:shd w:val="clear" w:fill="F7FAFA"/>
+          </w:tcPr>
+          <w:p>
+            <w:pPr>
+              <w:spacing w:after="20" w:before="20"/>
+              <w:jc w:val="right"/>
+            </w:pPr>
+            <w:r/>
+            <w:r>
+              <w:rPr>
+                <w:b w:val="0"/>
+                <w:sz w:val="17"/>
+              </w:rPr>
+              <w:t>47%</w:t>
+            </w:r>
+          </w:p>
+        </w:tc>
+        <w:tc>
+          <w:tcPr>
+            <w:tcW w:type="dxa" w:w="1296"/>
+            <w:shd w:val="clear" w:fill="F7FAFA"/>
+          </w:tcPr>
+          <w:p>
+            <w:pPr>
+              <w:spacing w:after="20" w:before="20"/>
+              <w:jc w:val="right"/>
+            </w:pPr>
+            <w:r/>
+            <w:r>
+              <w:rPr>
+                <w:b w:val="0"/>
+                <w:sz w:val="17"/>
+              </w:rPr>
+              <w:t>$24.46</w:t>
+            </w:r>
+          </w:p>
+        </w:tc>
+        <w:tc>
+          <w:tcPr>
+            <w:tcW w:type="dxa" w:w="1224"/>
+            <w:shd w:val="clear" w:fill="F7FAFA"/>
+          </w:tcPr>
+          <w:p>
+            <w:pPr>
+              <w:spacing w:after="20" w:before="20"/>
+              <w:jc w:val="right"/>
+            </w:pPr>
+            <w:r/>
+            <w:r>
+              <w:rPr>
+                <w:b w:val="0"/>
+                <w:sz w:val="17"/>
+              </w:rPr>
+              <w:t>$3.54</w:t>
+            </w:r>
+          </w:p>
+        </w:tc>
+        <w:tc>
+          <w:tcPr>
+            <w:tcW w:type="dxa" w:w="1656"/>
+            <w:shd w:val="clear" w:fill="F7FAFA"/>
+          </w:tcPr>
+          <w:p>
+            <w:pPr>
+              <w:spacing w:after="20" w:before="20"/>
+              <w:jc w:val="right"/>
+            </w:pPr>
+            <w:r/>
+            <w:r>
+              <w:rPr>
+                <w:b w:val="0"/>
+                <w:sz w:val="17"/>
+              </w:rPr>
+              <w:t>$293</w:t>
+            </w:r>
+          </w:p>
+        </w:tc>
+        <w:tc>
+          <w:tcPr>
+            <w:tcW w:type="dxa" w:w="1296"/>
+            <w:shd w:val="clear" w:fill="F7FAFA"/>
+          </w:tcPr>
+          <w:p>
+            <w:pPr>
+              <w:spacing w:after="20" w:before="20"/>
+              <w:jc w:val="right"/>
+            </w:pPr>
+            <w:r/>
+            <w:r>
+              <w:rPr>
+                <w:b w:val="0"/>
+                <w:sz w:val="17"/>
+              </w:rPr>
+              <w:t>$402</w:t>
+            </w:r>
+          </w:p>
+        </w:tc>
+      </w:tr>
+      <w:tr>
+        <w:tc>
+          <w:tcPr>
+            <w:tcW w:type="dxa" w:w="2088"/>
+          </w:tcPr>
+          <w:p>
+            <w:pPr>
+              <w:spacing w:after="20" w:before="20"/>
+              <w:jc w:val="left"/>
+            </w:pPr>
+            <w:r/>
+            <w:r>
+              <w:rPr>
+                <w:b w:val="0"/>
+                <w:sz w:val="17"/>
+              </w:rPr>
+              <w:t>U.S.</w:t>
+            </w:r>
+          </w:p>
+        </w:tc>
+        <w:tc>
+          <w:tcPr>
+            <w:tcW w:type="dxa" w:w="1656"/>
+          </w:tcPr>
+          <w:p>
+            <w:pPr>
+              <w:spacing w:after="20" w:before="20"/>
+              <w:jc w:val="right"/>
+            </w:pPr>
+            <w:r/>
+            <w:r>
+              <w:rPr>
+                <w:b w:val="0"/>
+                <w:sz w:val="17"/>
+              </w:rPr>
+              <w:t>16,706,979</w:t>
+            </w:r>
+          </w:p>
+        </w:tc>
+        <w:tc>
+          <w:tcPr>
+            <w:tcW w:type="dxa" w:w="1656"/>
+          </w:tcPr>
+          <w:p>
+            <w:pPr>
+              <w:spacing w:after="20" w:before="20"/>
+              <w:jc w:val="right"/>
+            </w:pPr>
+            <w:r/>
+            <w:r>
+              <w:rPr>
+                <w:b w:val="0"/>
+                <w:sz w:val="17"/>
+              </w:rPr>
+              <w:t>38,525,271</w:t>
+            </w:r>
+          </w:p>
+        </w:tc>
+        <w:tc>
+          <w:tcPr>
+            <w:tcW w:type="dxa" w:w="1512"/>
+          </w:tcPr>
+          <w:p>
+            <w:pPr>
+              <w:spacing w:after="20" w:before="20"/>
+              <w:jc w:val="right"/>
+            </w:pPr>
+            <w:r/>
+            <w:r>
+              <w:rPr>
+                <w:b w:val="0"/>
+                <w:sz w:val="17"/>
+              </w:rPr>
+              <w:t>1,759,285</w:t>
+            </w:r>
+          </w:p>
+        </w:tc>
+        <w:tc>
+          <w:tcPr>
+            <w:tcW w:type="dxa" w:w="864"/>
+          </w:tcPr>
+          <w:p>
+            <w:pPr>
+              <w:spacing w:after="20" w:before="20"/>
+              <w:jc w:val="right"/>
+            </w:pPr>
+            <w:r/>
+            <w:r>
+              <w:rPr>
+                <w:b w:val="0"/>
+                <w:sz w:val="17"/>
+              </w:rPr>
+              <w:t>68%</w:t>
+            </w:r>
+          </w:p>
+        </w:tc>
+        <w:tc>
+          <w:tcPr>
+            <w:tcW w:type="dxa" w:w="864"/>
+          </w:tcPr>
+          <w:p>
+            <w:pPr>
+              <w:spacing w:after="20" w:before="20"/>
+              <w:jc w:val="right"/>
+            </w:pPr>
+            <w:r/>
+            <w:r>
+              <w:rPr>
+                <w:b w:val="0"/>
+                <w:sz w:val="17"/>
+              </w:rPr>
+              <w:t>29%</w:t>
+            </w:r>
+          </w:p>
+        </w:tc>
+        <w:tc>
+          <w:tcPr>
+            <w:tcW w:type="dxa" w:w="1296"/>
+          </w:tcPr>
+          <w:p>
+            <w:pPr>
+              <w:spacing w:after="20" w:before="20"/>
+              <w:jc w:val="right"/>
+            </w:pPr>
+            <w:r/>
+            <w:r>
+              <w:rPr>
+                <w:b w:val="0"/>
+                <w:sz w:val="17"/>
+              </w:rPr>
+              <w:t>$24.56</w:t>
+            </w:r>
+          </w:p>
+        </w:tc>
+        <w:tc>
+          <w:tcPr>
+            <w:tcW w:type="dxa" w:w="1224"/>
+          </w:tcPr>
+          <w:p>
+            <w:pPr>
+              <w:spacing w:after="20" w:before="20"/>
+              <w:jc w:val="right"/>
+            </w:pPr>
+            <w:r/>
+            <w:r>
+              <w:rPr>
+                <w:b w:val="0"/>
+                <w:sz w:val="17"/>
+              </w:rPr>
+              <w:t>$2.38</w:t>
+            </w:r>
+          </w:p>
+        </w:tc>
+        <w:tc>
+          <w:tcPr>
+            <w:tcW w:type="dxa" w:w="1656"/>
+          </w:tcPr>
+          <w:p>
+            <w:pPr>
+              <w:spacing w:after="20" w:before="20"/>
+              <w:jc w:val="right"/>
+            </w:pPr>
+            <w:r/>
+            <w:r>
+              <w:rPr>
+                <w:b w:val="0"/>
+                <w:sz w:val="17"/>
+              </w:rPr>
+              <w:t>$3,552</w:t>
+            </w:r>
+          </w:p>
+        </w:tc>
+        <w:tc>
+          <w:tcPr>
+            <w:tcW w:type="dxa" w:w="1296"/>
+          </w:tcPr>
+          <w:p>
+            <w:pPr>
+              <w:spacing w:after="20" w:before="20"/>
+              <w:jc w:val="right"/>
+            </w:pPr>
+            <w:r/>
+            <w:r>
+              <w:rPr>
+                <w:b w:val="0"/>
+                <w:sz w:val="17"/>
+              </w:rPr>
+              <w:t>$4,828</w:t>
+            </w:r>
+          </w:p>
+        </w:tc>
+      </w:tr>
+      <w:tr>
+        <w:tc>
+          <w:tcPr>
+            <w:tcW w:type="dxa" w:w="2088"/>
+            <w:shd w:val="clear" w:fill="0B5C65"/>
+          </w:tcPr>
+          <w:p>
+            <w:pPr>
+              <w:spacing w:after="20" w:before="20"/>
+              <w:jc w:val="left"/>
+            </w:pPr>
+            <w:r/>
+            <w:r>
+              <w:rPr>
+                <w:b/>
+                <w:color w:val="FFFFFF"/>
+                <w:sz w:val="17"/>
+              </w:rPr>
+              <w:t>All sections</w:t>
+            </w:r>
+          </w:p>
+        </w:tc>
+        <w:tc>
+          <w:tcPr>
+            <w:tcW w:type="dxa" w:w="1656"/>
+            <w:shd w:val="clear" w:fill="0B5C65"/>
+          </w:tcPr>
+          <w:p>
+            <w:pPr>
+              <w:spacing w:after="20" w:before="20"/>
+              <w:jc w:val="right"/>
+            </w:pPr>
+            <w:r/>
+            <w:r>
+              <w:rPr>
+                <w:b/>
+                <w:color w:val="FFFFFF"/>
+                <w:sz w:val="17"/>
+              </w:rPr>
+              <w:t>100,157,487</w:t>
+            </w:r>
+          </w:p>
+        </w:tc>
+        <w:tc>
+          <w:tcPr>
+            <w:tcW w:type="dxa" w:w="1656"/>
+            <w:shd w:val="clear" w:fill="0B5C65"/>
+          </w:tcPr>
+          <w:p>
+            <w:pPr>
+              <w:spacing w:after="20" w:before="20"/>
+              <w:jc w:val="right"/>
+            </w:pPr>
+            <w:r/>
+            <w:r>
+              <w:rPr>
+                <w:b/>
+                <w:color w:val="FFFFFF"/>
+                <w:sz w:val="17"/>
+              </w:rPr>
+              <w:t>200,050,755</w:t>
+            </w:r>
+          </w:p>
+        </w:tc>
+        <w:tc>
+          <w:tcPr>
+            <w:tcW w:type="dxa" w:w="1512"/>
+            <w:shd w:val="clear" w:fill="0B5C65"/>
+          </w:tcPr>
+          <w:p>
+            <w:pPr>
+              <w:spacing w:after="20" w:before="20"/>
+              <w:jc w:val="right"/>
+            </w:pPr>
+            <w:r/>
+            <w:r>
+              <w:rPr>
+                <w:b/>
+                <w:color w:val="FFFFFF"/>
+                <w:sz w:val="17"/>
+              </w:rPr>
+              <w:t>10,310,431</w:t>
+            </w:r>
+          </w:p>
+        </w:tc>
+        <w:tc>
+          <w:tcPr>
+            <w:tcW w:type="dxa" w:w="864"/>
+            <w:shd w:val="clear" w:fill="0B5C65"/>
+          </w:tcPr>
+          <w:p>
+            <w:pPr>
+              <w:spacing w:after="20" w:before="20"/>
+              <w:jc w:val="right"/>
+            </w:pPr>
+            <w:r/>
+            <w:r>
+              <w:rPr>
+                <w:b/>
+                <w:color w:val="FFFFFF"/>
+                <w:sz w:val="17"/>
+              </w:rPr>
+              <w:t>64%</w:t>
+            </w:r>
+          </w:p>
+        </w:tc>
+        <w:tc>
+          <w:tcPr>
+            <w:tcW w:type="dxa" w:w="864"/>
+            <w:shd w:val="clear" w:fill="0B5C65"/>
+          </w:tcPr>
+          <w:p>
+            <w:pPr>
+              <w:spacing w:after="20" w:before="20"/>
+              <w:jc w:val="right"/>
+            </w:pPr>
+            <w:r/>
+            <w:r>
+              <w:rPr>
+                <w:b/>
+                <w:color w:val="FFFFFF"/>
+                <w:sz w:val="17"/>
+              </w:rPr>
+              <w:t>32%</w:t>
+            </w:r>
+          </w:p>
+        </w:tc>
+        <w:tc>
+          <w:tcPr>
+            <w:tcW w:type="dxa" w:w="1296"/>
+            <w:shd w:val="clear" w:fill="0B5C65"/>
+          </w:tcPr>
+          <w:p>
+            <w:pPr>
+              <w:spacing w:after="20" w:before="20"/>
+              <w:jc w:val="right"/>
+            </w:pPr>
+            <w:r/>
+            <w:r>
+              <w:rPr>
+                <w:b/>
+                <w:color w:val="FFFFFF"/>
+                <w:sz w:val="17"/>
+              </w:rPr>
+              <w:t>$25.17</w:t>
+            </w:r>
+          </w:p>
+        </w:tc>
+        <w:tc>
+          <w:tcPr>
+            <w:tcW w:type="dxa" w:w="1224"/>
+            <w:shd w:val="clear" w:fill="0B5C65"/>
+          </w:tcPr>
+          <w:p>
+            <w:pPr>
+              <w:spacing w:after="20" w:before="20"/>
+              <w:jc w:val="right"/>
+            </w:pPr>
+            <w:r/>
+            <w:r>
+              <w:rPr>
+                <w:b/>
+                <w:color w:val="FFFFFF"/>
+                <w:sz w:val="17"/>
+              </w:rPr>
+              <w:t>$2.63</w:t>
+            </w:r>
+          </w:p>
+        </w:tc>
+        <w:tc>
+          <w:tcPr>
+            <w:tcW w:type="dxa" w:w="1656"/>
+            <w:shd w:val="clear" w:fill="0B5C65"/>
+          </w:tcPr>
+          <w:p>
+            <w:pPr>
+              <w:spacing w:after="20" w:before="20"/>
+              <w:jc w:val="right"/>
+            </w:pPr>
+            <w:r/>
+            <w:r>
+              <w:rPr>
+                <w:b/>
+                <w:color w:val="FFFFFF"/>
+                <w:sz w:val="17"/>
+              </w:rPr>
+              <w:t>$16,723</w:t>
+            </w:r>
+          </w:p>
+        </w:tc>
+        <w:tc>
+          <w:tcPr>
+            <w:tcW w:type="dxa" w:w="1296"/>
+            <w:shd w:val="clear" w:fill="0B5C65"/>
+          </w:tcPr>
+          <w:p>
+            <w:pPr>
+              <w:spacing w:after="20" w:before="20"/>
+              <w:jc w:val="right"/>
+            </w:pPr>
+            <w:r/>
+            <w:r>
+              <w:rPr>
+                <w:b/>
+                <w:color w:val="FFFFFF"/>
+                <w:sz w:val="17"/>
+              </w:rPr>
+              <w:t>$22,734</w:t>
+            </w:r>
+          </w:p>
+        </w:tc>
+      </w:tr>
+    </w:tbl>
+    <w:p>
+      <w:pPr>
+        <w:spacing w:after="20"/>
+      </w:pPr>
+    </w:p>
+    <w:p>
+      <w:pPr>
+        <w:spacing w:before="240" w:after="60"/>
+      </w:pPr>
+      <w:r>
+        <w:rPr>
+          <w:b/>
+          <w:color w:val="0B5C65"/>
+          <w:sz w:val="24"/>
+        </w:rPr>
+        <w:t>2.  Slot-wise Summary</w:t>
+      </w:r>
+    </w:p>
+    <w:p>
+      <w:pPr>
+        <w:spacing w:after="100"/>
+      </w:pPr>
+      <w:r>
+        <w:rPr>
+          <w:b w:val="0"/>
+          <w:i w:val="0"/>
+          <w:color w:val="1F2A30"/>
+          <w:sz w:val="21"/>
+        </w:rPr>
+        <w:t>The six slots aggregated across all sections — showing where impression volume concentrates and how heavily each slot skews programmatic vs direct.</w:t>
+      </w:r>
+    </w:p>
+    <w:tbl>
+      <w:tblPr>
+        <w:tblW w:type="auto" w:w="0"/>
+        <w:jc w:val="center"/>
+        <w:tblLook w:firstColumn="1" w:firstRow="1" w:lastColumn="0" w:lastRow="0" w:noHBand="0" w:noVBand="1" w:val="04A0"/>
+        <w:tblBorders>
+          <w:top w:val="single" w:sz="6" w:space="0" w:color="C9D2D4"/>
+          <w:left w:val="single" w:sz="6" w:space="0" w:color="C9D2D4"/>
+          <w:bottom w:val="single" w:sz="6" w:space="0" w:color="C9D2D4"/>
+          <w:right w:val="single" w:sz="6" w:space="0" w:color="C9D2D4"/>
+          <w:insideH w:val="single" w:sz="6" w:space="0" w:color="C9D2D4"/>
+          <w:insideV w:val="single" w:sz="6" w:space="0" w:color="C9D2D4"/>
+        </w:tblBorders>
+      </w:tblPr>
+      <w:tblGrid>
+        <w:gridCol w:w="1382"/>
+        <w:gridCol w:w="1382"/>
+        <w:gridCol w:w="1382"/>
+        <w:gridCol w:w="1382"/>
+        <w:gridCol w:w="1382"/>
+        <w:gridCol w:w="1382"/>
+        <w:gridCol w:w="1382"/>
+        <w:gridCol w:w="1382"/>
+        <w:gridCol w:w="1382"/>
+        <w:gridCol w:w="1382"/>
+      </w:tblGrid>
+      <w:tr>
+        <w:tc>
+          <w:tcPr>
+            <w:tcW w:type="dxa" w:w="2088"/>
+            <w:shd w:val="clear" w:fill="0B5C65"/>
+          </w:tcPr>
+          <w:p>
+            <w:pPr>
+              <w:spacing w:after="20" w:before="20"/>
+              <w:jc w:val="left"/>
+            </w:pPr>
+            <w:r/>
+            <w:r>
+              <w:rPr>
+                <w:b/>
+                <w:color w:val="FFFFFF"/>
+                <w:sz w:val="16"/>
+              </w:rPr>
+              <w:t>Slot</w:t>
+            </w:r>
+          </w:p>
+        </w:tc>
+        <w:tc>
+          <w:tcPr>
+            <w:tcW w:type="dxa" w:w="1656"/>
+            <w:shd w:val="clear" w:fill="0B5C65"/>
+          </w:tcPr>
+          <w:p>
+            <w:pPr>
+              <w:spacing w:after="20" w:before="20"/>
+              <w:jc w:val="right"/>
+            </w:pPr>
+            <w:r/>
+            <w:r>
+              <w:rPr>
+                <w:b/>
+                <w:color w:val="FFFFFF"/>
+                <w:sz w:val="16"/>
+              </w:rPr>
+              <w:t>Direct imp</w:t>
+            </w:r>
+          </w:p>
+        </w:tc>
+        <w:tc>
+          <w:tcPr>
+            <w:tcW w:type="dxa" w:w="1656"/>
+            <w:shd w:val="clear" w:fill="0B5C65"/>
+          </w:tcPr>
+          <w:p>
+            <w:pPr>
+              <w:spacing w:after="20" w:before="20"/>
+              <w:jc w:val="right"/>
+            </w:pPr>
+            <w:r/>
+            <w:r>
+              <w:rPr>
+                <w:b/>
+                <w:color w:val="FFFFFF"/>
+                <w:sz w:val="16"/>
+              </w:rPr>
+              <w:t>Prog. imp</w:t>
+            </w:r>
+          </w:p>
+        </w:tc>
+        <w:tc>
+          <w:tcPr>
+            <w:tcW w:type="dxa" w:w="1512"/>
+            <w:shd w:val="clear" w:fill="0B5C65"/>
+          </w:tcPr>
+          <w:p>
+            <w:pPr>
+              <w:spacing w:after="20" w:before="20"/>
+              <w:jc w:val="right"/>
+            </w:pPr>
+            <w:r/>
+            <w:r>
+              <w:rPr>
+                <w:b/>
+                <w:color w:val="FFFFFF"/>
+                <w:sz w:val="16"/>
+              </w:rPr>
+              <w:t>House imp</w:t>
+            </w:r>
+          </w:p>
+        </w:tc>
+        <w:tc>
+          <w:tcPr>
+            <w:tcW w:type="dxa" w:w="864"/>
+            <w:shd w:val="clear" w:fill="0B5C65"/>
+          </w:tcPr>
+          <w:p>
+            <w:pPr>
+              <w:spacing w:after="20" w:before="20"/>
+              <w:jc w:val="right"/>
+            </w:pPr>
+            <w:r/>
+            <w:r>
+              <w:rPr>
+                <w:b/>
+                <w:color w:val="FFFFFF"/>
+                <w:sz w:val="16"/>
+              </w:rPr>
+              <w:t>Prog %</w:t>
+            </w:r>
+          </w:p>
+        </w:tc>
+        <w:tc>
+          <w:tcPr>
+            <w:tcW w:type="dxa" w:w="864"/>
+            <w:shd w:val="clear" w:fill="0B5C65"/>
+          </w:tcPr>
+          <w:p>
+            <w:pPr>
+              <w:spacing w:after="20" w:before="20"/>
+              <w:jc w:val="right"/>
+            </w:pPr>
+            <w:r/>
+            <w:r>
+              <w:rPr>
+                <w:b/>
+                <w:color w:val="FFFFFF"/>
+                <w:sz w:val="16"/>
+              </w:rPr>
+              <w:t>Dir %</w:t>
+            </w:r>
+          </w:p>
+        </w:tc>
+        <w:tc>
+          <w:tcPr>
+            <w:tcW w:type="dxa" w:w="1296"/>
+            <w:shd w:val="clear" w:fill="0B5C65"/>
+          </w:tcPr>
+          <w:p>
+            <w:pPr>
+              <w:spacing w:after="20" w:before="20"/>
+              <w:jc w:val="right"/>
+            </w:pPr>
+            <w:r/>
+            <w:r>
+              <w:rPr>
+                <w:b/>
+                <w:color w:val="FFFFFF"/>
+                <w:sz w:val="16"/>
+              </w:rPr>
+              <w:t>Direct CPM</w:t>
+            </w:r>
+          </w:p>
+        </w:tc>
+        <w:tc>
+          <w:tcPr>
+            <w:tcW w:type="dxa" w:w="1224"/>
+            <w:shd w:val="clear" w:fill="0B5C65"/>
+          </w:tcPr>
+          <w:p>
+            <w:pPr>
+              <w:spacing w:after="20" w:before="20"/>
+              <w:jc w:val="right"/>
+            </w:pPr>
+            <w:r/>
+            <w:r>
+              <w:rPr>
+                <w:b/>
+                <w:color w:val="FFFFFF"/>
+                <w:sz w:val="16"/>
+              </w:rPr>
+              <w:t>Prog CPM</w:t>
+            </w:r>
+          </w:p>
+        </w:tc>
+        <w:tc>
+          <w:tcPr>
+            <w:tcW w:type="dxa" w:w="1656"/>
+            <w:shd w:val="clear" w:fill="0B5C65"/>
+          </w:tcPr>
+          <w:p>
+            <w:pPr>
+              <w:spacing w:after="20" w:before="20"/>
+              <w:jc w:val="right"/>
+            </w:pPr>
+            <w:r/>
+            <w:r>
+              <w:rPr>
+                <w:b/>
+                <w:color w:val="FFFFFF"/>
+                <w:sz w:val="16"/>
+              </w:rPr>
+              <w:t>Target opp/mo @$8</w:t>
+            </w:r>
+          </w:p>
+        </w:tc>
+        <w:tc>
+          <w:tcPr>
+            <w:tcW w:type="dxa" w:w="1296"/>
+            <w:shd w:val="clear" w:fill="0B5C65"/>
+          </w:tcPr>
+          <w:p>
+            <w:pPr>
+              <w:spacing w:after="20" w:before="20"/>
+              <w:jc w:val="right"/>
+            </w:pPr>
+            <w:r/>
+            <w:r>
+              <w:rPr>
+                <w:b/>
+                <w:color w:val="FFFFFF"/>
+                <w:sz w:val="16"/>
+              </w:rPr>
+              <w:t>@$10</w:t>
+            </w:r>
+          </w:p>
+        </w:tc>
+      </w:tr>
+      <w:tr>
+        <w:tc>
+          <w:tcPr>
+            <w:tcW w:type="dxa" w:w="2088"/>
+          </w:tcPr>
+          <w:p>
+            <w:pPr>
+              <w:spacing w:after="20" w:before="20"/>
+              <w:jc w:val="left"/>
+            </w:pPr>
+            <w:r/>
+            <w:r>
+              <w:rPr>
+                <w:b w:val="0"/>
+                <w:sz w:val="17"/>
+              </w:rPr>
+              <w:t>stickyfooter1</w:t>
+            </w:r>
+          </w:p>
+        </w:tc>
+        <w:tc>
+          <w:tcPr>
+            <w:tcW w:type="dxa" w:w="1656"/>
+          </w:tcPr>
+          <w:p>
+            <w:pPr>
+              <w:spacing w:after="20" w:before="20"/>
+              <w:jc w:val="right"/>
+            </w:pPr>
+            <w:r/>
+            <w:r>
+              <w:rPr>
+                <w:b w:val="0"/>
+                <w:sz w:val="17"/>
+              </w:rPr>
+              <w:t>32,532,070</w:t>
+            </w:r>
+          </w:p>
+        </w:tc>
+        <w:tc>
+          <w:tcPr>
+            <w:tcW w:type="dxa" w:w="1656"/>
+          </w:tcPr>
+          <w:p>
+            <w:pPr>
+              <w:spacing w:after="20" w:before="20"/>
+              <w:jc w:val="right"/>
+            </w:pPr>
+            <w:r/>
+            <w:r>
+              <w:rPr>
+                <w:b w:val="0"/>
+                <w:sz w:val="17"/>
+              </w:rPr>
+              <w:t>91,556,001</w:t>
+            </w:r>
+          </w:p>
+        </w:tc>
+        <w:tc>
+          <w:tcPr>
+            <w:tcW w:type="dxa" w:w="1512"/>
+          </w:tcPr>
+          <w:p>
+            <w:pPr>
+              <w:spacing w:after="20" w:before="20"/>
+              <w:jc w:val="right"/>
+            </w:pPr>
+            <w:r/>
+            <w:r>
+              <w:rPr>
+                <w:b w:val="0"/>
+                <w:sz w:val="17"/>
+              </w:rPr>
+              <w:t>3,874,619</w:t>
+            </w:r>
+          </w:p>
+        </w:tc>
+        <w:tc>
+          <w:tcPr>
+            <w:tcW w:type="dxa" w:w="864"/>
+          </w:tcPr>
+          <w:p>
+            <w:pPr>
+              <w:spacing w:after="20" w:before="20"/>
+              <w:jc w:val="right"/>
+            </w:pPr>
+            <w:r/>
+            <w:r>
+              <w:rPr>
+                <w:b w:val="0"/>
+                <w:sz w:val="17"/>
+              </w:rPr>
+              <w:t>72%</w:t>
+            </w:r>
+          </w:p>
+        </w:tc>
+        <w:tc>
+          <w:tcPr>
+            <w:tcW w:type="dxa" w:w="864"/>
+          </w:tcPr>
+          <w:p>
+            <w:pPr>
+              <w:spacing w:after="20" w:before="20"/>
+              <w:jc w:val="right"/>
+            </w:pPr>
+            <w:r/>
+            <w:r>
+              <w:rPr>
+                <w:b w:val="0"/>
+                <w:sz w:val="17"/>
+              </w:rPr>
+              <w:t>25%</w:t>
+            </w:r>
+          </w:p>
+        </w:tc>
+        <w:tc>
+          <w:tcPr>
+            <w:tcW w:type="dxa" w:w="1296"/>
+          </w:tcPr>
+          <w:p>
+            <w:pPr>
+              <w:spacing w:after="20" w:before="20"/>
+              <w:jc w:val="right"/>
+            </w:pPr>
+            <w:r/>
+            <w:r>
+              <w:rPr>
+                <w:b w:val="0"/>
+                <w:sz w:val="17"/>
+              </w:rPr>
+              <w:t>$23.72</w:t>
+            </w:r>
+          </w:p>
+        </w:tc>
+        <w:tc>
+          <w:tcPr>
+            <w:tcW w:type="dxa" w:w="1224"/>
+          </w:tcPr>
+          <w:p>
+            <w:pPr>
+              <w:spacing w:after="20" w:before="20"/>
+              <w:jc w:val="right"/>
+            </w:pPr>
+            <w:r/>
+            <w:r>
+              <w:rPr>
+                <w:b w:val="0"/>
+                <w:sz w:val="17"/>
+              </w:rPr>
+              <w:t>$2.14</w:t>
+            </w:r>
+          </w:p>
+        </w:tc>
+        <w:tc>
+          <w:tcPr>
+            <w:tcW w:type="dxa" w:w="1656"/>
+          </w:tcPr>
+          <w:p>
+            <w:pPr>
+              <w:spacing w:after="20" w:before="20"/>
+              <w:jc w:val="right"/>
+            </w:pPr>
+            <w:r/>
+            <w:r>
+              <w:rPr>
+                <w:b w:val="0"/>
+                <w:sz w:val="17"/>
+              </w:rPr>
+              <w:t>$10,739</w:t>
+            </w:r>
+          </w:p>
+        </w:tc>
+        <w:tc>
+          <w:tcPr>
+            <w:tcW w:type="dxa" w:w="1296"/>
+          </w:tcPr>
+          <w:p>
+            <w:pPr>
+              <w:spacing w:after="20" w:before="20"/>
+              <w:jc w:val="right"/>
+            </w:pPr>
+            <w:r/>
+            <w:r>
+              <w:rPr>
+                <w:b w:val="0"/>
+                <w:sz w:val="17"/>
+              </w:rPr>
+              <w:t>$14,401</w:t>
+            </w:r>
+          </w:p>
+        </w:tc>
+      </w:tr>
+      <w:tr>
+        <w:tc>
+          <w:tcPr>
+            <w:tcW w:type="dxa" w:w="2088"/>
+            <w:shd w:val="clear" w:fill="F7FAFA"/>
+          </w:tcPr>
+          <w:p>
+            <w:pPr>
+              <w:spacing w:after="20" w:before="20"/>
+              <w:jc w:val="left"/>
+            </w:pPr>
+            <w:r/>
+            <w:r>
+              <w:rPr>
+                <w:b w:val="0"/>
+                <w:sz w:val="17"/>
+              </w:rPr>
+              <w:t>leaderboard1</w:t>
+            </w:r>
+          </w:p>
+        </w:tc>
+        <w:tc>
+          <w:tcPr>
+            <w:tcW w:type="dxa" w:w="1656"/>
+            <w:shd w:val="clear" w:fill="F7FAFA"/>
+          </w:tcPr>
+          <w:p>
+            <w:pPr>
+              <w:spacing w:after="20" w:before="20"/>
+              <w:jc w:val="right"/>
+            </w:pPr>
+            <w:r/>
+            <w:r>
+              <w:rPr>
+                <w:b w:val="0"/>
+                <w:sz w:val="17"/>
+              </w:rPr>
+              <w:t>27,963,246</w:t>
+            </w:r>
+          </w:p>
+        </w:tc>
+        <w:tc>
+          <w:tcPr>
+            <w:tcW w:type="dxa" w:w="1656"/>
+            <w:shd w:val="clear" w:fill="F7FAFA"/>
+          </w:tcPr>
+          <w:p>
+            <w:pPr>
+              <w:spacing w:after="20" w:before="20"/>
+              <w:jc w:val="right"/>
+            </w:pPr>
+            <w:r/>
+            <w:r>
+              <w:rPr>
+                <w:b w:val="0"/>
+                <w:sz w:val="17"/>
+              </w:rPr>
+              <w:t>28,657,336</w:t>
+            </w:r>
+          </w:p>
+        </w:tc>
+        <w:tc>
+          <w:tcPr>
+            <w:tcW w:type="dxa" w:w="1512"/>
+            <w:shd w:val="clear" w:fill="F7FAFA"/>
+          </w:tcPr>
+          <w:p>
+            <w:pPr>
+              <w:spacing w:after="20" w:before="20"/>
+              <w:jc w:val="right"/>
+            </w:pPr>
+            <w:r/>
+            <w:r>
+              <w:rPr>
+                <w:b w:val="0"/>
+                <w:sz w:val="17"/>
+              </w:rPr>
+              <w:t>2,121,116</w:t>
+            </w:r>
+          </w:p>
+        </w:tc>
+        <w:tc>
+          <w:tcPr>
+            <w:tcW w:type="dxa" w:w="864"/>
+            <w:shd w:val="clear" w:fill="F7FAFA"/>
+          </w:tcPr>
+          <w:p>
+            <w:pPr>
+              <w:spacing w:after="20" w:before="20"/>
+              <w:jc w:val="right"/>
+            </w:pPr>
+            <w:r/>
+            <w:r>
+              <w:rPr>
+                <w:b w:val="0"/>
+                <w:sz w:val="17"/>
+              </w:rPr>
+              <w:t>49%</w:t>
+            </w:r>
+          </w:p>
+        </w:tc>
+        <w:tc>
+          <w:tcPr>
+            <w:tcW w:type="dxa" w:w="864"/>
+            <w:shd w:val="clear" w:fill="F7FAFA"/>
+          </w:tcPr>
+          <w:p>
+            <w:pPr>
+              <w:spacing w:after="20" w:before="20"/>
+              <w:jc w:val="right"/>
+            </w:pPr>
+            <w:r/>
+            <w:r>
+              <w:rPr>
+                <w:b w:val="0"/>
+                <w:sz w:val="17"/>
+              </w:rPr>
+              <w:t>48%</w:t>
+            </w:r>
+          </w:p>
+        </w:tc>
+        <w:tc>
+          <w:tcPr>
+            <w:tcW w:type="dxa" w:w="1296"/>
+            <w:shd w:val="clear" w:fill="F7FAFA"/>
+          </w:tcPr>
+          <w:p>
+            <w:pPr>
+              <w:spacing w:after="20" w:before="20"/>
+              <w:jc w:val="right"/>
+            </w:pPr>
+            <w:r/>
+            <w:r>
+              <w:rPr>
+                <w:b w:val="0"/>
+                <w:sz w:val="17"/>
+              </w:rPr>
+              <w:t>$27.05</w:t>
+            </w:r>
+          </w:p>
+        </w:tc>
+        <w:tc>
+          <w:tcPr>
+            <w:tcW w:type="dxa" w:w="1224"/>
+            <w:shd w:val="clear" w:fill="F7FAFA"/>
+          </w:tcPr>
+          <w:p>
+            <w:pPr>
+              <w:spacing w:after="20" w:before="20"/>
+              <w:jc w:val="right"/>
+            </w:pPr>
+            <w:r/>
+            <w:r>
+              <w:rPr>
+                <w:b w:val="0"/>
+                <w:sz w:val="17"/>
+              </w:rPr>
+              <w:t>$2.25</w:t>
+            </w:r>
+          </w:p>
+        </w:tc>
+        <w:tc>
+          <w:tcPr>
+            <w:tcW w:type="dxa" w:w="1656"/>
+            <w:shd w:val="clear" w:fill="F7FAFA"/>
+          </w:tcPr>
+          <w:p>
+            <w:pPr>
+              <w:spacing w:after="20" w:before="20"/>
+              <w:jc w:val="right"/>
+            </w:pPr>
+            <w:r/>
+            <w:r>
+              <w:rPr>
+                <w:b w:val="0"/>
+                <w:sz w:val="17"/>
+              </w:rPr>
+              <w:t>$0</w:t>
+            </w:r>
+          </w:p>
+        </w:tc>
+        <w:tc>
+          <w:tcPr>
+            <w:tcW w:type="dxa" w:w="1296"/>
+            <w:shd w:val="clear" w:fill="F7FAFA"/>
+          </w:tcPr>
+          <w:p>
+            <w:pPr>
+              <w:spacing w:after="20" w:before="20"/>
+              <w:jc w:val="right"/>
+            </w:pPr>
+            <w:r/>
+            <w:r>
+              <w:rPr>
+                <w:b w:val="0"/>
+                <w:sz w:val="17"/>
+              </w:rPr>
+              <w:t>$0</w:t>
+            </w:r>
+          </w:p>
+        </w:tc>
+      </w:tr>
+      <w:tr>
+        <w:tc>
+          <w:tcPr>
+            <w:tcW w:type="dxa" w:w="2088"/>
+          </w:tcPr>
+          <w:p>
+            <w:pPr>
+              <w:spacing w:after="20" w:before="20"/>
+              <w:jc w:val="left"/>
+            </w:pPr>
+            <w:r/>
+            <w:r>
+              <w:rPr>
+                <w:b w:val="0"/>
+                <w:sz w:val="17"/>
+              </w:rPr>
+              <w:t>inline1</w:t>
+            </w:r>
+          </w:p>
+        </w:tc>
+        <w:tc>
+          <w:tcPr>
+            <w:tcW w:type="dxa" w:w="1656"/>
+          </w:tcPr>
+          <w:p>
+            <w:pPr>
+              <w:spacing w:after="20" w:before="20"/>
+              <w:jc w:val="right"/>
+            </w:pPr>
+            <w:r/>
+            <w:r>
+              <w:rPr>
+                <w:b w:val="0"/>
+                <w:sz w:val="17"/>
+              </w:rPr>
+              <w:t>14,465,035</w:t>
+            </w:r>
+          </w:p>
+        </w:tc>
+        <w:tc>
+          <w:tcPr>
+            <w:tcW w:type="dxa" w:w="1656"/>
+          </w:tcPr>
+          <w:p>
+            <w:pPr>
+              <w:spacing w:after="20" w:before="20"/>
+              <w:jc w:val="right"/>
+            </w:pPr>
+            <w:r/>
+            <w:r>
+              <w:rPr>
+                <w:b w:val="0"/>
+                <w:sz w:val="17"/>
+              </w:rPr>
+              <w:t>25,229,629</w:t>
+            </w:r>
+          </w:p>
+        </w:tc>
+        <w:tc>
+          <w:tcPr>
+            <w:tcW w:type="dxa" w:w="1512"/>
+          </w:tcPr>
+          <w:p>
+            <w:pPr>
+              <w:spacing w:after="20" w:before="20"/>
+              <w:jc w:val="right"/>
+            </w:pPr>
+            <w:r/>
+            <w:r>
+              <w:rPr>
+                <w:b w:val="0"/>
+                <w:sz w:val="17"/>
+              </w:rPr>
+              <w:t>1,129,281</w:t>
+            </w:r>
+          </w:p>
+        </w:tc>
+        <w:tc>
+          <w:tcPr>
+            <w:tcW w:type="dxa" w:w="864"/>
+          </w:tcPr>
+          <w:p>
+            <w:pPr>
+              <w:spacing w:after="20" w:before="20"/>
+              <w:jc w:val="right"/>
+            </w:pPr>
+            <w:r/>
+            <w:r>
+              <w:rPr>
+                <w:b w:val="0"/>
+                <w:sz w:val="17"/>
+              </w:rPr>
+              <w:t>62%</w:t>
+            </w:r>
+          </w:p>
+        </w:tc>
+        <w:tc>
+          <w:tcPr>
+            <w:tcW w:type="dxa" w:w="864"/>
+          </w:tcPr>
+          <w:p>
+            <w:pPr>
+              <w:spacing w:after="20" w:before="20"/>
+              <w:jc w:val="right"/>
+            </w:pPr>
+            <w:r/>
+            <w:r>
+              <w:rPr>
+                <w:b w:val="0"/>
+                <w:sz w:val="17"/>
+              </w:rPr>
+              <w:t>35%</w:t>
+            </w:r>
+          </w:p>
+        </w:tc>
+        <w:tc>
+          <w:tcPr>
+            <w:tcW w:type="dxa" w:w="1296"/>
+          </w:tcPr>
+          <w:p>
+            <w:pPr>
+              <w:spacing w:after="20" w:before="20"/>
+              <w:jc w:val="right"/>
+            </w:pPr>
+            <w:r/>
+            <w:r>
+              <w:rPr>
+                <w:b w:val="0"/>
+                <w:sz w:val="17"/>
+              </w:rPr>
+              <w:t>$24.57</w:t>
+            </w:r>
+          </w:p>
+        </w:tc>
+        <w:tc>
+          <w:tcPr>
+            <w:tcW w:type="dxa" w:w="1224"/>
+          </w:tcPr>
+          <w:p>
+            <w:pPr>
+              <w:spacing w:after="20" w:before="20"/>
+              <w:jc w:val="right"/>
+            </w:pPr>
+            <w:r/>
+            <w:r>
+              <w:rPr>
+                <w:b w:val="0"/>
+                <w:sz w:val="17"/>
+              </w:rPr>
+              <w:t>$3.71</w:t>
+            </w:r>
+          </w:p>
+        </w:tc>
+        <w:tc>
+          <w:tcPr>
+            <w:tcW w:type="dxa" w:w="1656"/>
+          </w:tcPr>
+          <w:p>
+            <w:pPr>
+              <w:spacing w:after="20" w:before="20"/>
+              <w:jc w:val="right"/>
+            </w:pPr>
+            <w:r/>
+            <w:r>
+              <w:rPr>
+                <w:b w:val="0"/>
+                <w:sz w:val="17"/>
+              </w:rPr>
+              <w:t>$1,717</w:t>
+            </w:r>
+          </w:p>
+        </w:tc>
+        <w:tc>
+          <w:tcPr>
+            <w:tcW w:type="dxa" w:w="1296"/>
+          </w:tcPr>
+          <w:p>
+            <w:pPr>
+              <w:spacing w:after="20" w:before="20"/>
+              <w:jc w:val="right"/>
+            </w:pPr>
+            <w:r/>
+            <w:r>
+              <w:rPr>
+                <w:b w:val="0"/>
+                <w:sz w:val="17"/>
+              </w:rPr>
+              <w:t>$2,406</w:t>
+            </w:r>
+          </w:p>
+        </w:tc>
+      </w:tr>
+      <w:tr>
+        <w:tc>
+          <w:tcPr>
+            <w:tcW w:type="dxa" w:w="2088"/>
+            <w:shd w:val="clear" w:fill="F7FAFA"/>
+          </w:tcPr>
+          <w:p>
+            <w:pPr>
+              <w:spacing w:after="20" w:before="20"/>
+              <w:jc w:val="left"/>
+            </w:pPr>
+            <w:r/>
+            <w:r>
+              <w:rPr>
+                <w:b w:val="0"/>
+                <w:sz w:val="17"/>
+              </w:rPr>
+              <w:t>inline2</w:t>
+            </w:r>
+          </w:p>
+        </w:tc>
+        <w:tc>
+          <w:tcPr>
+            <w:tcW w:type="dxa" w:w="1656"/>
+            <w:shd w:val="clear" w:fill="F7FAFA"/>
+          </w:tcPr>
+          <w:p>
+            <w:pPr>
+              <w:spacing w:after="20" w:before="20"/>
+              <w:jc w:val="right"/>
+            </w:pPr>
+            <w:r/>
+            <w:r>
+              <w:rPr>
+                <w:b w:val="0"/>
+                <w:sz w:val="17"/>
+              </w:rPr>
+              <w:t>9,939,514</w:t>
+            </w:r>
+          </w:p>
+        </w:tc>
+        <w:tc>
+          <w:tcPr>
+            <w:tcW w:type="dxa" w:w="1656"/>
+            <w:shd w:val="clear" w:fill="F7FAFA"/>
+          </w:tcPr>
+          <w:p>
+            <w:pPr>
+              <w:spacing w:after="20" w:before="20"/>
+              <w:jc w:val="right"/>
+            </w:pPr>
+            <w:r/>
+            <w:r>
+              <w:rPr>
+                <w:b w:val="0"/>
+                <w:sz w:val="17"/>
+              </w:rPr>
+              <w:t>22,046,408</w:t>
+            </w:r>
+          </w:p>
+        </w:tc>
+        <w:tc>
+          <w:tcPr>
+            <w:tcW w:type="dxa" w:w="1512"/>
+            <w:shd w:val="clear" w:fill="F7FAFA"/>
+          </w:tcPr>
+          <w:p>
+            <w:pPr>
+              <w:spacing w:after="20" w:before="20"/>
+              <w:jc w:val="right"/>
+            </w:pPr>
+            <w:r/>
+            <w:r>
+              <w:rPr>
+                <w:b w:val="0"/>
+                <w:sz w:val="17"/>
+              </w:rPr>
+              <w:t>1,185,514</w:t>
+            </w:r>
+          </w:p>
+        </w:tc>
+        <w:tc>
+          <w:tcPr>
+            <w:tcW w:type="dxa" w:w="864"/>
+            <w:shd w:val="clear" w:fill="F7FAFA"/>
+          </w:tcPr>
+          <w:p>
+            <w:pPr>
+              <w:spacing w:after="20" w:before="20"/>
+              <w:jc w:val="right"/>
+            </w:pPr>
+            <w:r/>
+            <w:r>
+              <w:rPr>
+                <w:b w:val="0"/>
+                <w:sz w:val="17"/>
+              </w:rPr>
+              <w:t>66%</w:t>
+            </w:r>
+          </w:p>
+        </w:tc>
+        <w:tc>
+          <w:tcPr>
+            <w:tcW w:type="dxa" w:w="864"/>
+            <w:shd w:val="clear" w:fill="F7FAFA"/>
+          </w:tcPr>
+          <w:p>
+            <w:pPr>
+              <w:spacing w:after="20" w:before="20"/>
+              <w:jc w:val="right"/>
+            </w:pPr>
+            <w:r/>
+            <w:r>
+              <w:rPr>
+                <w:b w:val="0"/>
+                <w:sz w:val="17"/>
+              </w:rPr>
+              <w:t>30%</w:t>
+            </w:r>
+          </w:p>
+        </w:tc>
+        <w:tc>
+          <w:tcPr>
+            <w:tcW w:type="dxa" w:w="1296"/>
+            <w:shd w:val="clear" w:fill="F7FAFA"/>
+          </w:tcPr>
+          <w:p>
+            <w:pPr>
+              <w:spacing w:after="20" w:before="20"/>
+              <w:jc w:val="right"/>
+            </w:pPr>
+            <w:r/>
+            <w:r>
+              <w:rPr>
+                <w:b w:val="0"/>
+                <w:sz w:val="17"/>
+              </w:rPr>
+              <w:t>$27.16</w:t>
+            </w:r>
+          </w:p>
+        </w:tc>
+        <w:tc>
+          <w:tcPr>
+            <w:tcW w:type="dxa" w:w="1224"/>
+            <w:shd w:val="clear" w:fill="F7FAFA"/>
+          </w:tcPr>
+          <w:p>
+            <w:pPr>
+              <w:spacing w:after="20" w:before="20"/>
+              <w:jc w:val="right"/>
+            </w:pPr>
+            <w:r/>
+            <w:r>
+              <w:rPr>
+                <w:b w:val="0"/>
+                <w:sz w:val="17"/>
+              </w:rPr>
+              <w:t>$3.17</w:t>
+            </w:r>
+          </w:p>
+        </w:tc>
+        <w:tc>
+          <w:tcPr>
+            <w:tcW w:type="dxa" w:w="1656"/>
+            <w:shd w:val="clear" w:fill="F7FAFA"/>
+          </w:tcPr>
+          <w:p>
+            <w:pPr>
+              <w:spacing w:after="20" w:before="20"/>
+              <w:jc w:val="right"/>
+            </w:pPr>
+            <w:r/>
+            <w:r>
+              <w:rPr>
+                <w:b w:val="0"/>
+                <w:sz w:val="17"/>
+              </w:rPr>
+              <w:t>$1,619</w:t>
+            </w:r>
+          </w:p>
+        </w:tc>
+        <w:tc>
+          <w:tcPr>
+            <w:tcW w:type="dxa" w:w="1296"/>
+            <w:shd w:val="clear" w:fill="F7FAFA"/>
+          </w:tcPr>
+          <w:p>
+            <w:pPr>
+              <w:spacing w:after="20" w:before="20"/>
+              <w:jc w:val="right"/>
+            </w:pPr>
+            <w:r/>
+            <w:r>
+              <w:rPr>
+                <w:b w:val="0"/>
+                <w:sz w:val="17"/>
+              </w:rPr>
+              <w:t>$2,231</w:t>
+            </w:r>
+          </w:p>
+        </w:tc>
+      </w:tr>
+      <w:tr>
+        <w:tc>
+          <w:tcPr>
+            <w:tcW w:type="dxa" w:w="2088"/>
+          </w:tcPr>
+          <w:p>
+            <w:pPr>
+              <w:spacing w:after="20" w:before="20"/>
+              <w:jc w:val="left"/>
+            </w:pPr>
+            <w:r/>
+            <w:r>
+              <w:rPr>
+                <w:b w:val="0"/>
+                <w:sz w:val="17"/>
+              </w:rPr>
+              <w:t>inline3</w:t>
+            </w:r>
+          </w:p>
+        </w:tc>
+        <w:tc>
+          <w:tcPr>
+            <w:tcW w:type="dxa" w:w="1656"/>
+          </w:tcPr>
+          <w:p>
+            <w:pPr>
+              <w:spacing w:after="20" w:before="20"/>
+              <w:jc w:val="right"/>
+            </w:pPr>
+            <w:r/>
+            <w:r>
+              <w:rPr>
+                <w:b w:val="0"/>
+                <w:sz w:val="17"/>
+              </w:rPr>
+              <w:t>6,973,208</w:t>
+            </w:r>
+          </w:p>
+        </w:tc>
+        <w:tc>
+          <w:tcPr>
+            <w:tcW w:type="dxa" w:w="1656"/>
+          </w:tcPr>
+          <w:p>
+            <w:pPr>
+              <w:spacing w:after="20" w:before="20"/>
+              <w:jc w:val="right"/>
+            </w:pPr>
+            <w:r/>
+            <w:r>
+              <w:rPr>
+                <w:b w:val="0"/>
+                <w:sz w:val="17"/>
+              </w:rPr>
+              <w:t>18,763,956</w:t>
+            </w:r>
+          </w:p>
+        </w:tc>
+        <w:tc>
+          <w:tcPr>
+            <w:tcW w:type="dxa" w:w="1512"/>
+          </w:tcPr>
+          <w:p>
+            <w:pPr>
+              <w:spacing w:after="20" w:before="20"/>
+              <w:jc w:val="right"/>
+            </w:pPr>
+            <w:r/>
+            <w:r>
+              <w:rPr>
+                <w:b w:val="0"/>
+                <w:sz w:val="17"/>
+              </w:rPr>
+              <w:t>1,104,641</w:t>
+            </w:r>
+          </w:p>
+        </w:tc>
+        <w:tc>
+          <w:tcPr>
+            <w:tcW w:type="dxa" w:w="864"/>
+          </w:tcPr>
+          <w:p>
+            <w:pPr>
+              <w:spacing w:after="20" w:before="20"/>
+              <w:jc w:val="right"/>
+            </w:pPr>
+            <w:r/>
+            <w:r>
+              <w:rPr>
+                <w:b w:val="0"/>
+                <w:sz w:val="17"/>
+              </w:rPr>
+              <w:t>70%</w:t>
+            </w:r>
+          </w:p>
+        </w:tc>
+        <w:tc>
+          <w:tcPr>
+            <w:tcW w:type="dxa" w:w="864"/>
+          </w:tcPr>
+          <w:p>
+            <w:pPr>
+              <w:spacing w:after="20" w:before="20"/>
+              <w:jc w:val="right"/>
+            </w:pPr>
+            <w:r/>
+            <w:r>
+              <w:rPr>
+                <w:b w:val="0"/>
+                <w:sz w:val="17"/>
+              </w:rPr>
+              <w:t>26%</w:t>
+            </w:r>
+          </w:p>
+        </w:tc>
+        <w:tc>
+          <w:tcPr>
+            <w:tcW w:type="dxa" w:w="1296"/>
+          </w:tcPr>
+          <w:p>
+            <w:pPr>
+              <w:spacing w:after="20" w:before="20"/>
+              <w:jc w:val="right"/>
+            </w:pPr>
+            <w:r/>
+            <w:r>
+              <w:rPr>
+                <w:b w:val="0"/>
+                <w:sz w:val="17"/>
+              </w:rPr>
+              <w:t>$26.54</w:t>
+            </w:r>
+          </w:p>
+        </w:tc>
+        <w:tc>
+          <w:tcPr>
+            <w:tcW w:type="dxa" w:w="1224"/>
+          </w:tcPr>
+          <w:p>
+            <w:pPr>
+              <w:spacing w:after="20" w:before="20"/>
+              <w:jc w:val="right"/>
+            </w:pPr>
+            <w:r/>
+            <w:r>
+              <w:rPr>
+                <w:b w:val="0"/>
+                <w:sz w:val="17"/>
+              </w:rPr>
+              <w:t>$3.03</w:t>
+            </w:r>
+          </w:p>
+        </w:tc>
+        <w:tc>
+          <w:tcPr>
+            <w:tcW w:type="dxa" w:w="1656"/>
+          </w:tcPr>
+          <w:p>
+            <w:pPr>
+              <w:spacing w:after="20" w:before="20"/>
+              <w:jc w:val="right"/>
+            </w:pPr>
+            <w:r/>
+            <w:r>
+              <w:rPr>
+                <w:b w:val="0"/>
+                <w:sz w:val="17"/>
+              </w:rPr>
+              <w:t>$1,809</w:t>
+            </w:r>
+          </w:p>
+        </w:tc>
+        <w:tc>
+          <w:tcPr>
+            <w:tcW w:type="dxa" w:w="1296"/>
+          </w:tcPr>
+          <w:p>
+            <w:pPr>
+              <w:spacing w:after="20" w:before="20"/>
+              <w:jc w:val="right"/>
+            </w:pPr>
+            <w:r/>
+            <w:r>
+              <w:rPr>
+                <w:b w:val="0"/>
+                <w:sz w:val="17"/>
+              </w:rPr>
+              <w:t>$2,533</w:t>
+            </w:r>
+          </w:p>
+        </w:tc>
+      </w:tr>
+      <w:tr>
+        <w:tc>
+          <w:tcPr>
+            <w:tcW w:type="dxa" w:w="2088"/>
+            <w:shd w:val="clear" w:fill="F7FAFA"/>
+          </w:tcPr>
+          <w:p>
+            <w:pPr>
+              <w:spacing w:after="20" w:before="20"/>
+              <w:jc w:val="left"/>
+            </w:pPr>
+            <w:r/>
+            <w:r>
+              <w:rPr>
+                <w:b w:val="0"/>
+                <w:sz w:val="17"/>
+              </w:rPr>
+              <w:t>rightrail1</w:t>
+            </w:r>
+          </w:p>
+        </w:tc>
+        <w:tc>
+          <w:tcPr>
+            <w:tcW w:type="dxa" w:w="1656"/>
+            <w:shd w:val="clear" w:fill="F7FAFA"/>
+          </w:tcPr>
+          <w:p>
+            <w:pPr>
+              <w:spacing w:after="20" w:before="20"/>
+              <w:jc w:val="right"/>
+            </w:pPr>
+            <w:r/>
+            <w:r>
+              <w:rPr>
+                <w:b w:val="0"/>
+                <w:sz w:val="17"/>
+              </w:rPr>
+              <w:t>8,284,414</w:t>
+            </w:r>
+          </w:p>
+        </w:tc>
+        <w:tc>
+          <w:tcPr>
+            <w:tcW w:type="dxa" w:w="1656"/>
+            <w:shd w:val="clear" w:fill="F7FAFA"/>
+          </w:tcPr>
+          <w:p>
+            <w:pPr>
+              <w:spacing w:after="20" w:before="20"/>
+              <w:jc w:val="right"/>
+            </w:pPr>
+            <w:r/>
+            <w:r>
+              <w:rPr>
+                <w:b w:val="0"/>
+                <w:sz w:val="17"/>
+              </w:rPr>
+              <w:t>13,797,425</w:t>
+            </w:r>
+          </w:p>
+        </w:tc>
+        <w:tc>
+          <w:tcPr>
+            <w:tcW w:type="dxa" w:w="1512"/>
+            <w:shd w:val="clear" w:fill="F7FAFA"/>
+          </w:tcPr>
+          <w:p>
+            <w:pPr>
+              <w:spacing w:after="20" w:before="20"/>
+              <w:jc w:val="right"/>
+            </w:pPr>
+            <w:r/>
+            <w:r>
+              <w:rPr>
+                <w:b w:val="0"/>
+                <w:sz w:val="17"/>
+              </w:rPr>
+              <w:t>895,260</w:t>
+            </w:r>
+          </w:p>
+        </w:tc>
+        <w:tc>
+          <w:tcPr>
+            <w:tcW w:type="dxa" w:w="864"/>
+            <w:shd w:val="clear" w:fill="F7FAFA"/>
+          </w:tcPr>
+          <w:p>
+            <w:pPr>
+              <w:spacing w:after="20" w:before="20"/>
+              <w:jc w:val="right"/>
+            </w:pPr>
+            <w:r/>
+            <w:r>
+              <w:rPr>
+                <w:b w:val="0"/>
+                <w:sz w:val="17"/>
+              </w:rPr>
+              <w:t>60%</w:t>
+            </w:r>
+          </w:p>
+        </w:tc>
+        <w:tc>
+          <w:tcPr>
+            <w:tcW w:type="dxa" w:w="864"/>
+            <w:shd w:val="clear" w:fill="F7FAFA"/>
+          </w:tcPr>
+          <w:p>
+            <w:pPr>
+              <w:spacing w:after="20" w:before="20"/>
+              <w:jc w:val="right"/>
+            </w:pPr>
+            <w:r/>
+            <w:r>
+              <w:rPr>
+                <w:b w:val="0"/>
+                <w:sz w:val="17"/>
+              </w:rPr>
+              <w:t>36%</w:t>
+            </w:r>
+          </w:p>
+        </w:tc>
+        <w:tc>
+          <w:tcPr>
+            <w:tcW w:type="dxa" w:w="1296"/>
+            <w:shd w:val="clear" w:fill="F7FAFA"/>
+          </w:tcPr>
+          <w:p>
+            <w:pPr>
+              <w:spacing w:after="20" w:before="20"/>
+              <w:jc w:val="right"/>
+            </w:pPr>
+            <w:r/>
+            <w:r>
+              <w:rPr>
+                <w:b w:val="0"/>
+                <w:sz w:val="17"/>
+              </w:rPr>
+              <w:t>$22.07</w:t>
+            </w:r>
+          </w:p>
+        </w:tc>
+        <w:tc>
+          <w:tcPr>
+            <w:tcW w:type="dxa" w:w="1224"/>
+            <w:shd w:val="clear" w:fill="F7FAFA"/>
+          </w:tcPr>
+          <w:p>
+            <w:pPr>
+              <w:spacing w:after="20" w:before="20"/>
+              <w:jc w:val="right"/>
+            </w:pPr>
+            <w:r/>
+            <w:r>
+              <w:rPr>
+                <w:b w:val="0"/>
+                <w:sz w:val="17"/>
+              </w:rPr>
+              <w:t>$3.34</w:t>
+            </w:r>
+          </w:p>
+        </w:tc>
+        <w:tc>
+          <w:tcPr>
+            <w:tcW w:type="dxa" w:w="1656"/>
+            <w:shd w:val="clear" w:fill="F7FAFA"/>
+          </w:tcPr>
+          <w:p>
+            <w:pPr>
+              <w:spacing w:after="20" w:before="20"/>
+              <w:jc w:val="right"/>
+            </w:pPr>
+            <w:r/>
+            <w:r>
+              <w:rPr>
+                <w:b w:val="0"/>
+                <w:sz w:val="17"/>
+              </w:rPr>
+              <w:t>$839</w:t>
+            </w:r>
+          </w:p>
+        </w:tc>
+        <w:tc>
+          <w:tcPr>
+            <w:tcW w:type="dxa" w:w="1296"/>
+            <w:shd w:val="clear" w:fill="F7FAFA"/>
+          </w:tcPr>
+          <w:p>
+            <w:pPr>
+              <w:spacing w:after="20" w:before="20"/>
+              <w:jc w:val="right"/>
+            </w:pPr>
+            <w:r/>
+            <w:r>
+              <w:rPr>
+                <w:b w:val="0"/>
+                <w:sz w:val="17"/>
+              </w:rPr>
+              <w:t>$1,163</w:t>
+            </w:r>
+          </w:p>
+        </w:tc>
+      </w:tr>
+      <w:tr>
+        <w:tc>
+          <w:tcPr>
+            <w:tcW w:type="dxa" w:w="2088"/>
+            <w:shd w:val="clear" w:fill="0B5C65"/>
+          </w:tcPr>
+          <w:p>
+            <w:pPr>
+              <w:spacing w:after="20" w:before="20"/>
+              <w:jc w:val="left"/>
+            </w:pPr>
+            <w:r/>
+            <w:r>
+              <w:rPr>
+                <w:b/>
+                <w:color w:val="FFFFFF"/>
+                <w:sz w:val="17"/>
+              </w:rPr>
+              <w:t>All slots</w:t>
+            </w:r>
+          </w:p>
+        </w:tc>
+        <w:tc>
+          <w:tcPr>
+            <w:tcW w:type="dxa" w:w="1656"/>
+            <w:shd w:val="clear" w:fill="0B5C65"/>
+          </w:tcPr>
+          <w:p>
+            <w:pPr>
+              <w:spacing w:after="20" w:before="20"/>
+              <w:jc w:val="right"/>
+            </w:pPr>
+            <w:r/>
+            <w:r>
+              <w:rPr>
+                <w:b/>
+                <w:color w:val="FFFFFF"/>
+                <w:sz w:val="17"/>
+              </w:rPr>
+              <w:t>100,157,487</w:t>
+            </w:r>
+          </w:p>
+        </w:tc>
+        <w:tc>
+          <w:tcPr>
+            <w:tcW w:type="dxa" w:w="1656"/>
+            <w:shd w:val="clear" w:fill="0B5C65"/>
+          </w:tcPr>
+          <w:p>
+            <w:pPr>
+              <w:spacing w:after="20" w:before="20"/>
+              <w:jc w:val="right"/>
+            </w:pPr>
+            <w:r/>
+            <w:r>
+              <w:rPr>
+                <w:b/>
+                <w:color w:val="FFFFFF"/>
+                <w:sz w:val="17"/>
+              </w:rPr>
+              <w:t>200,050,755</w:t>
+            </w:r>
+          </w:p>
+        </w:tc>
+        <w:tc>
+          <w:tcPr>
+            <w:tcW w:type="dxa" w:w="1512"/>
+            <w:shd w:val="clear" w:fill="0B5C65"/>
+          </w:tcPr>
+          <w:p>
+            <w:pPr>
+              <w:spacing w:after="20" w:before="20"/>
+              <w:jc w:val="right"/>
+            </w:pPr>
+            <w:r/>
+            <w:r>
+              <w:rPr>
+                <w:b/>
+                <w:color w:val="FFFFFF"/>
+                <w:sz w:val="17"/>
+              </w:rPr>
+              <w:t>10,310,431</w:t>
+            </w:r>
+          </w:p>
+        </w:tc>
+        <w:tc>
+          <w:tcPr>
+            <w:tcW w:type="dxa" w:w="864"/>
+            <w:shd w:val="clear" w:fill="0B5C65"/>
+          </w:tcPr>
+          <w:p>
+            <w:pPr>
+              <w:spacing w:after="20" w:before="20"/>
+              <w:jc w:val="right"/>
+            </w:pPr>
+            <w:r/>
+            <w:r>
+              <w:rPr>
+                <w:b/>
+                <w:color w:val="FFFFFF"/>
+                <w:sz w:val="17"/>
+              </w:rPr>
+              <w:t>64%</w:t>
+            </w:r>
+          </w:p>
+        </w:tc>
+        <w:tc>
+          <w:tcPr>
+            <w:tcW w:type="dxa" w:w="864"/>
+            <w:shd w:val="clear" w:fill="0B5C65"/>
+          </w:tcPr>
+          <w:p>
+            <w:pPr>
+              <w:spacing w:after="20" w:before="20"/>
+              <w:jc w:val="right"/>
+            </w:pPr>
+            <w:r/>
+            <w:r>
+              <w:rPr>
+                <w:b/>
+                <w:color w:val="FFFFFF"/>
+                <w:sz w:val="17"/>
+              </w:rPr>
+              <w:t>32%</w:t>
+            </w:r>
+          </w:p>
+        </w:tc>
+        <w:tc>
+          <w:tcPr>
+            <w:tcW w:type="dxa" w:w="1296"/>
+            <w:shd w:val="clear" w:fill="0B5C65"/>
+          </w:tcPr>
+          <w:p>
+            <w:pPr>
+              <w:spacing w:after="20" w:before="20"/>
+              <w:jc w:val="right"/>
+            </w:pPr>
+            <w:r/>
+            <w:r>
+              <w:rPr>
+                <w:b/>
+                <w:color w:val="FFFFFF"/>
+                <w:sz w:val="17"/>
+              </w:rPr>
+              <w:t>$25.17</w:t>
+            </w:r>
+          </w:p>
+        </w:tc>
+        <w:tc>
+          <w:tcPr>
+            <w:tcW w:type="dxa" w:w="1224"/>
+            <w:shd w:val="clear" w:fill="0B5C65"/>
+          </w:tcPr>
+          <w:p>
+            <w:pPr>
+              <w:spacing w:after="20" w:before="20"/>
+              <w:jc w:val="right"/>
+            </w:pPr>
+            <w:r/>
+            <w:r>
+              <w:rPr>
+                <w:b/>
+                <w:color w:val="FFFFFF"/>
+                <w:sz w:val="17"/>
+              </w:rPr>
+              <w:t>$2.63</w:t>
+            </w:r>
+          </w:p>
+        </w:tc>
+        <w:tc>
+          <w:tcPr>
+            <w:tcW w:type="dxa" w:w="1656"/>
+            <w:shd w:val="clear" w:fill="0B5C65"/>
+          </w:tcPr>
+          <w:p>
+            <w:pPr>
+              <w:spacing w:after="20" w:before="20"/>
+              <w:jc w:val="right"/>
+            </w:pPr>
+            <w:r/>
+            <w:r>
+              <w:rPr>
+                <w:b/>
+                <w:color w:val="FFFFFF"/>
+                <w:sz w:val="17"/>
+              </w:rPr>
+              <w:t>$16,723</w:t>
+            </w:r>
+          </w:p>
+        </w:tc>
+        <w:tc>
+          <w:tcPr>
+            <w:tcW w:type="dxa" w:w="1296"/>
+            <w:shd w:val="clear" w:fill="0B5C65"/>
+          </w:tcPr>
+          <w:p>
+            <w:pPr>
+              <w:spacing w:after="20" w:before="20"/>
+              <w:jc w:val="right"/>
+            </w:pPr>
+            <w:r/>
+            <w:r>
+              <w:rPr>
+                <w:b/>
+                <w:color w:val="FFFFFF"/>
+                <w:sz w:val="17"/>
+              </w:rPr>
+              <w:t>$22,734</w:t>
+            </w:r>
+          </w:p>
+        </w:tc>
+      </w:tr>
+    </w:tbl>
+    <w:p>
+      <w:pPr>
+        <w:spacing w:after="20"/>
+      </w:pPr>
+    </w:p>
+    <w:p>
+      <w:pPr>
+        <w:spacing w:before="240" w:after="60"/>
+      </w:pPr>
+      <w:r>
+        <w:rPr>
+          <w:b/>
+          <w:color w:val="0B5C65"/>
+          <w:sz w:val="24"/>
+        </w:rPr>
+        <w:t>3.  Conversion Targets — Ranked</w:t>
       </w:r>
     </w:p>
     <w:p>
@@ -3518,7 +6646,7 @@
           <w:color w:val="0B5C65"/>
           <w:sz w:val="24"/>
         </w:rPr>
-        <w:t>2.  Reserved for Direct Sales</w:t>
+        <w:t>4.  Reserved for Direct Sales</w:t>
       </w:r>
     </w:p>
     <w:p>
@@ -4783,7 +7911,7 @@
           <w:color w:val="0B5C65"/>
           <w:sz w:val="24"/>
         </w:rPr>
-        <w:t>3.  Section-by-Section Detail — Every Slot</w:t>
+        <w:t>5.  Section-by-Section Detail — Every Slot</w:t>
       </w:r>
     </w:p>
     <w:p>
@@ -13043,7 +16171,7 @@
           <w:color w:val="0B5C65"/>
           <w:sz w:val="24"/>
         </w:rPr>
-        <w:t>4.  Conversion Model — Targets Only</w:t>
+        <w:t>6.  Conversion Model — Targets Only</w:t>
       </w:r>
     </w:p>
     <w:p>
@@ -13606,7 +16734,7 @@
           <w:color w:val="0B5C65"/>
           <w:sz w:val="24"/>
         </w:rPr>
-        <w:t>5.  What This Means</w:t>
+        <w:t>7.  What This Means</w:t>
       </w:r>
     </w:p>
     <w:p>

</xml_diff>